<commit_message>
Add DYNA Research Engineer/Scientist job applications and resume extraction script
</commit_message>
<xml_diff>
--- a/Applications/20260405_Foundation_Robotics_Application/Alex Nettekoven Resume Foundation-Robot-Learning-v1.docx
+++ b/Applications/20260405_Foundation_Robotics_Application/Alex Nettekoven Resume Foundation-Robot-Learning-v1.docx
@@ -177,7 +177,7 @@
           <w:szCs w:val="22"/>
           <w:rtl w:val="0"/>
         </w:rPr>
-        <w:t>Robotics researcher and engineer applying for VLA/Robotics ML Engineer at Foundation Robotics. I specialize in training and deploying multimodal models and vision-language-action models (VLAs), including diffusion policies and vision transformers, reinforcement learning, and sim-to-real transfer for manipulation. 5+ years building novel robotic systems in real-world environments; focused on bridging the last mile of deployment.</w:t>
+        <w:t>Robotics researcher and engineer applying for VLA/Robotics ML Engineer at Foundation Robotics. I specialize in real-world deployment of robotics foundation models (VLAs, world action models), reinforcement learning, and sim-to-real transfer for manipulation and humanoid embodiments. 5+ years building novel robotic systems in real-world environments; focused on bridging the last mile of deployment.</w:t>
       </w:r>
       <w:r>
         <w:rPr>
@@ -1316,27 +1316,6 @@
     </w:p>
     <w:p>
       <w:pPr>
-        <w:pBdr>
-          <w:bottom w:color="000000" w:space="1" w:sz="6" w:val="single"/>
-        </w:pBdr>
-        <w:rPr>
-          <w:b w:val="1"/>
-          <w:bCs w:val="1"/>
-          <w:smallCaps w:val="1"/>
-        </w:rPr>
-      </w:pPr>
-      <w:r>
-        <w:rPr>
-          <w:b w:val="1"/>
-          <w:bCs w:val="1"/>
-          <w:smallCaps w:val="1"/>
-          <w:rtl w:val="0"/>
-        </w:rPr>
-        <w:t>PUBLICATION RECORD</w:t>
-      </w:r>
-    </w:p>
-    <w:p>
-      <w:pPr>
         <w:rPr>
           <w:sz w:val="10"/>
           <w:szCs w:val="10"/>
@@ -1346,72 +1325,6 @@
         <w:rPr>
           <w:rtl w:val="0"/>
         </w:rPr>
-      </w:r>
-    </w:p>
-    <w:p>
-      <w:pPr>
-        <w:numPr>
-          <w:ilvl w:val="0"/>
-          <w:numId w:val="1"/>
-        </w:numPr>
-        <w:ind w:left="720" w:hanging="360"/>
-        <w:rPr>
-          <w:sz w:val="22"/>
-          <w:szCs w:val="22"/>
-          <w:u w:val="none"/>
-        </w:rPr>
-      </w:pPr>
-      <w:r>
-        <w:rPr>
-          <w:sz w:val="22"/>
-          <w:szCs w:val="22"/>
-          <w:rtl w:val="0"/>
-        </w:rPr>
-        <w:t>Alexander Nettekoven, Matthew Carlin &amp; Ufuk Topcu. "Agile Combat Employment System (ACES) Model Modifications." AFWERX SBIR Phase III Technical Report, 2024. (Multi-agent deep reinforcement learning for autonomous fleet coordination.)</w:t>
-      </w:r>
-    </w:p>
-    <w:p>
-      <w:pPr>
-        <w:numPr>
-          <w:ilvl w:val="0"/>
-          <w:numId w:val="1"/>
-        </w:numPr>
-        <w:ind w:left="720" w:hanging="360"/>
-        <w:rPr>
-          <w:sz w:val="22"/>
-          <w:szCs w:val="22"/>
-          <w:u w:val="none"/>
-        </w:rPr>
-      </w:pPr>
-      <w:r>
-        <w:rPr>
-          <w:sz w:val="22"/>
-          <w:szCs w:val="22"/>
-          <w:rtl w:val="0"/>
-        </w:rPr>
-        <w:t>Zizhao Wang, Xuesu Xiao, Alexander J. Nettekoven, Kadhiravan Umasankar, Anika Singh, Sriram Bommakanti, Ufuk Topcu, and Peter Stone. "From agile ground to aerial navigation: Learning from learned hallucination." IROS 2021.</w:t>
-      </w:r>
-    </w:p>
-    <w:p>
-      <w:pPr>
-        <w:numPr>
-          <w:ilvl w:val="0"/>
-          <w:numId w:val="1"/>
-        </w:numPr>
-        <w:ind w:left="720" w:hanging="360"/>
-        <w:rPr>
-          <w:sz w:val="22"/>
-          <w:szCs w:val="22"/>
-          <w:u w:val="none"/>
-        </w:rPr>
-      </w:pPr>
-      <w:r>
-        <w:rPr>
-          <w:sz w:val="22"/>
-          <w:szCs w:val="22"/>
-          <w:rtl w:val="0"/>
-        </w:rPr>
-        <w:t>Alexander Nettekoven and Ufuk Topcu. "A 3D Printing Hexacopter: Design and Documentation." ICUAS 2021.</w:t>
       </w:r>
     </w:p>
     <w:p>
@@ -1512,7 +1425,7 @@
           <w:szCs w:val="22"/>
           <w:rtl w:val="0"/>
         </w:rPr>
-        <w:t>Robotics: Bimanual Manipulation, Grasping, Kinematics (forward, inverse), Whole-Body Control, 2D/3D Perception (SLAM, VIO, OpenCV), scene understanding, Motion Planning, Sim-to-Real Transfer</w:t>
+        <w:t>Robotics: Bimanual Manipulation, Grasping, Kinematics (forward, inverse), Whole-Body Control, 2D/3D Perception (SLAM, VIO, OpenCV), Motion Planning, Sim-to-Real Transfer</w:t>
       </w:r>
     </w:p>
     <w:p>
@@ -1554,7 +1467,7 @@
           <w:szCs w:val="22"/>
           <w:rtl w:val="0"/>
         </w:rPr>
-        <w:t>VLA &amp; Foundation Models: VLMs, multimodal encoders/decoders, DreamZero, pi0.5, SmolVLA, ACT, Diffusion Policies</w:t>
+        <w:t>VLA and Multimodal Foundation Models: VLMs (SigLIP, Qwen-VL, PaliGemma), transformer architectures (ViT, DiT), OpenVLA, DreamZero, pi0.5, SmolVLA, ACT, Diffusion Policies</w:t>
       </w:r>
     </w:p>
     <w:p>
@@ -1596,7 +1509,7 @@
           <w:szCs w:val="22"/>
           <w:rtl w:val="0"/>
         </w:rPr>
-        <w:t xml:space="preserve">Programming &amp; Tools: Python, C++, PyTorch, ROS2, Isaac Sim/Isaac Lab (domain randomization, sim-to-real), Embedded Systems, Docker, Linux, Edge Deployment, Systems Design, CAD (SolidWorks, OnShape), Git</w:t>
+        <w:t xml:space="preserve">Programming &amp; Tools: Python, C++, PyTorch, ROS2, Isaac Sim/Isaac Lab, MuJoCo (domain randomization, sim-to-real), Firmware &amp; Embedded Systems (Arduino, Raspberry Pi, UDP, TCP, UART), Docker, Linux, Edge Deployment, Systems Design, CAD (SolidWorks, OnShape), Git</w:t>
       </w:r>
     </w:p>
     <w:p>

</xml_diff>